<commit_message>
Correções na documentação após revisão
</commit_message>
<xml_diff>
--- a/private/documentacao/Documentação_VOOH.docx
+++ b/private/documentacao/Documentação_VOOH.docx
@@ -778,11 +778,13 @@
           <w:numId w:val="34"/>
         </w:numPr>
         <w:tabs>
+          <w:tab w:val="clear" w:pos="0"/>
+          <w:tab w:val="num" w:pos="751"/>
           <w:tab w:val="left" w:pos="1941"/>
           <w:tab w:val="right" w:leader="dot" w:pos="9661"/>
         </w:tabs>
         <w:spacing w:before="125"/>
-        <w:ind w:left="567" w:hanging="751"/>
+        <w:ind w:left="1318" w:hanging="751"/>
         <w:rPr>
           <w:rFonts w:cs="Arial"/>
           <w:sz w:val="24"/>
@@ -878,10 +880,12 @@
           <w:numId w:val="34"/>
         </w:numPr>
         <w:tabs>
+          <w:tab w:val="clear" w:pos="0"/>
+          <w:tab w:val="num" w:pos="751"/>
           <w:tab w:val="left" w:pos="1941"/>
           <w:tab w:val="right" w:leader="dot" w:pos="9661"/>
         </w:tabs>
-        <w:ind w:left="567" w:hanging="751"/>
+        <w:ind w:left="1318" w:hanging="751"/>
         <w:rPr>
           <w:rFonts w:cs="Arial"/>
           <w:sz w:val="24"/>
@@ -951,10 +955,12 @@
           <w:numId w:val="34"/>
         </w:numPr>
         <w:tabs>
+          <w:tab w:val="clear" w:pos="0"/>
+          <w:tab w:val="num" w:pos="751"/>
           <w:tab w:val="left" w:pos="1941"/>
           <w:tab w:val="right" w:leader="dot" w:pos="9661"/>
         </w:tabs>
-        <w:ind w:left="567" w:hanging="751"/>
+        <w:ind w:left="1318" w:hanging="751"/>
         <w:rPr>
           <w:rFonts w:cs="Arial"/>
           <w:sz w:val="24"/>
@@ -997,10 +1003,12 @@
           <w:numId w:val="34"/>
         </w:numPr>
         <w:tabs>
+          <w:tab w:val="clear" w:pos="0"/>
+          <w:tab w:val="num" w:pos="751"/>
           <w:tab w:val="left" w:pos="1941"/>
           <w:tab w:val="right" w:leader="dot" w:pos="9661"/>
         </w:tabs>
-        <w:ind w:left="567" w:hanging="751"/>
+        <w:ind w:left="1318" w:hanging="751"/>
         <w:rPr>
           <w:rFonts w:cs="Arial"/>
           <w:sz w:val="24"/>
@@ -1035,10 +1043,12 @@
           <w:numId w:val="34"/>
         </w:numPr>
         <w:tabs>
+          <w:tab w:val="clear" w:pos="0"/>
+          <w:tab w:val="num" w:pos="751"/>
           <w:tab w:val="left" w:pos="1941"/>
           <w:tab w:val="right" w:leader="dot" w:pos="9661"/>
         </w:tabs>
-        <w:ind w:left="567" w:hanging="751"/>
+        <w:ind w:left="1318" w:hanging="751"/>
         <w:rPr>
           <w:rFonts w:cs="Arial"/>
           <w:sz w:val="24"/>
@@ -1073,11 +1083,13 @@
           <w:numId w:val="34"/>
         </w:numPr>
         <w:tabs>
+          <w:tab w:val="clear" w:pos="0"/>
+          <w:tab w:val="num" w:pos="751"/>
           <w:tab w:val="left" w:pos="1941"/>
           <w:tab w:val="right" w:leader="dot" w:pos="9661"/>
         </w:tabs>
         <w:spacing w:before="133"/>
-        <w:ind w:left="567" w:hanging="751"/>
+        <w:ind w:left="1318" w:hanging="751"/>
         <w:rPr>
           <w:rFonts w:cs="Arial"/>
           <w:sz w:val="24"/>
@@ -1164,7 +1176,7 @@
           <w:tab w:val="right" w:leader="dot" w:pos="9661"/>
         </w:tabs>
         <w:spacing w:before="133"/>
-        <w:ind w:left="567" w:firstLine="0"/>
+        <w:ind w:left="708" w:firstLine="0"/>
         <w:rPr>
           <w:rFonts w:cs="Arial"/>
           <w:sz w:val="24"/>
@@ -1177,7 +1189,23 @@
           <w:sz w:val="24"/>
           <w:szCs w:val="24"/>
         </w:rPr>
-        <w:t xml:space="preserve">4.4.1 Limites </w:t>
+        <w:t>4.</w:t>
+      </w:r>
+      <w:r>
+        <w:rPr>
+          <w:rFonts w:cs="Arial"/>
+          <w:sz w:val="24"/>
+          <w:szCs w:val="24"/>
+        </w:rPr>
+        <w:t>6</w:t>
+      </w:r>
+      <w:r>
+        <w:rPr>
+          <w:rFonts w:cs="Arial"/>
+          <w:sz w:val="24"/>
+          <w:szCs w:val="24"/>
+        </w:rPr>
+        <w:t xml:space="preserve">.1 Limites </w:t>
       </w:r>
       <w:r>
         <w:rPr>
@@ -1197,7 +1225,7 @@
           <w:tab w:val="right" w:leader="dot" w:pos="9661"/>
         </w:tabs>
         <w:spacing w:before="133"/>
-        <w:ind w:left="567" w:firstLine="0"/>
+        <w:ind w:left="708" w:firstLine="0"/>
         <w:rPr>
           <w:rFonts w:cs="Arial"/>
           <w:sz w:val="24"/>
@@ -1210,7 +1238,23 @@
           <w:sz w:val="24"/>
           <w:szCs w:val="24"/>
         </w:rPr>
-        <w:t xml:space="preserve">4.4.2 Exclusões </w:t>
+        <w:t>4.</w:t>
+      </w:r>
+      <w:r>
+        <w:rPr>
+          <w:rFonts w:cs="Arial"/>
+          <w:sz w:val="24"/>
+          <w:szCs w:val="24"/>
+        </w:rPr>
+        <w:t>6</w:t>
+      </w:r>
+      <w:r>
+        <w:rPr>
+          <w:rFonts w:cs="Arial"/>
+          <w:sz w:val="24"/>
+          <w:szCs w:val="24"/>
+        </w:rPr>
+        <w:t xml:space="preserve">.2 Exclusões </w:t>
       </w:r>
       <w:r>
         <w:rPr>
@@ -1230,11 +1274,13 @@
           <w:numId w:val="34"/>
         </w:numPr>
         <w:tabs>
+          <w:tab w:val="clear" w:pos="0"/>
+          <w:tab w:val="num" w:pos="751"/>
           <w:tab w:val="left" w:pos="1941"/>
           <w:tab w:val="right" w:leader="dot" w:pos="9661"/>
         </w:tabs>
         <w:spacing w:before="134"/>
-        <w:ind w:left="567" w:hanging="751"/>
+        <w:ind w:left="1318" w:hanging="751"/>
         <w:rPr>
           <w:rFonts w:cs="Arial"/>
           <w:sz w:val="24"/>
@@ -1304,10 +1350,12 @@
           <w:numId w:val="34"/>
         </w:numPr>
         <w:tabs>
+          <w:tab w:val="clear" w:pos="0"/>
+          <w:tab w:val="num" w:pos="751"/>
           <w:tab w:val="left" w:pos="1941"/>
           <w:tab w:val="right" w:leader="dot" w:pos="9661"/>
         </w:tabs>
-        <w:ind w:left="567" w:hanging="751"/>
+        <w:ind w:left="1318" w:hanging="751"/>
         <w:rPr>
           <w:rFonts w:cs="Arial"/>
           <w:sz w:val="24"/>
@@ -1385,10 +1433,12 @@
           <w:numId w:val="34"/>
         </w:numPr>
         <w:tabs>
+          <w:tab w:val="clear" w:pos="0"/>
+          <w:tab w:val="num" w:pos="751"/>
           <w:tab w:val="left" w:pos="1941"/>
           <w:tab w:val="right" w:leader="dot" w:pos="9661"/>
         </w:tabs>
-        <w:ind w:left="567" w:hanging="751"/>
+        <w:ind w:left="1318" w:hanging="751"/>
         <w:rPr>
           <w:rFonts w:cs="Arial"/>
           <w:sz w:val="24"/>
@@ -1412,15 +1462,6 @@
           <w:szCs w:val="24"/>
         </w:rPr>
         <w:t xml:space="preserve"> </w:t>
-      </w:r>
-      <w:r>
-        <w:rPr>
-          <w:rFonts w:cs="Arial"/>
-          <w:spacing w:val="-5"/>
-          <w:sz w:val="24"/>
-          <w:szCs w:val="24"/>
-        </w:rPr>
-        <w:tab/>
       </w:r>
       <w:r>
         <w:rPr>
@@ -1458,11 +1499,13 @@
           <w:numId w:val="34"/>
         </w:numPr>
         <w:tabs>
+          <w:tab w:val="clear" w:pos="0"/>
+          <w:tab w:val="num" w:pos="751"/>
           <w:tab w:val="left" w:pos="1941"/>
           <w:tab w:val="right" w:leader="dot" w:pos="9661"/>
         </w:tabs>
         <w:spacing w:before="134"/>
-        <w:ind w:left="567" w:hanging="751"/>
+        <w:ind w:left="1318" w:hanging="751"/>
         <w:rPr>
           <w:rFonts w:cs="Arial"/>
           <w:sz w:val="24"/>
@@ -1515,11 +1558,13 @@
           <w:numId w:val="34"/>
         </w:numPr>
         <w:tabs>
+          <w:tab w:val="clear" w:pos="0"/>
+          <w:tab w:val="num" w:pos="751"/>
           <w:tab w:val="left" w:pos="1941"/>
           <w:tab w:val="right" w:leader="dot" w:pos="9661"/>
         </w:tabs>
         <w:spacing w:before="134"/>
-        <w:ind w:left="567" w:hanging="751"/>
+        <w:ind w:left="1318" w:hanging="751"/>
         <w:rPr>
           <w:rFonts w:cs="Arial"/>
           <w:sz w:val="24"/>
@@ -1554,11 +1599,13 @@
           <w:numId w:val="34"/>
         </w:numPr>
         <w:tabs>
+          <w:tab w:val="clear" w:pos="0"/>
+          <w:tab w:val="num" w:pos="751"/>
           <w:tab w:val="left" w:pos="1941"/>
           <w:tab w:val="right" w:leader="dot" w:pos="9661"/>
         </w:tabs>
         <w:spacing w:before="134"/>
-        <w:ind w:left="567" w:hanging="751"/>
+        <w:ind w:left="1318" w:hanging="751"/>
         <w:rPr>
           <w:rFonts w:cs="Arial"/>
           <w:sz w:val="24"/>
@@ -1797,7 +1844,7 @@
         <w:ind w:firstLine="708"/>
         <w:jc w:val="both"/>
         <w:rPr>
-          <w:rFonts w:ascii="Arial MT" w:hAnsi="Arial MT" w:cs="Arial" w:hint="eastAsia"/>
+          <w:rFonts w:ascii="Arial MT" w:hAnsi="Arial MT" w:cs="Arial"/>
         </w:rPr>
       </w:pPr>
       <w:r>
@@ -1906,7 +1953,7 @@
     </w:p>
     <w:p>
       <w:pPr>
-        <w:jc w:val="both"/>
+        <w:jc w:val="center"/>
         <w:rPr>
           <w:rFonts w:ascii="Arial MT" w:hAnsi="Arial MT" w:cs="Arial" w:hint="eastAsia"/>
         </w:rPr>
@@ -1919,10 +1966,10 @@
           <w:noProof/>
         </w:rPr>
         <w:drawing>
-          <wp:inline distT="0" distB="0" distL="0" distR="0" wp14:anchorId="63463E46" wp14:editId="7C312B59">
-            <wp:extent cx="5752465" cy="2812415"/>
-            <wp:effectExtent l="0" t="0" r="635" b="6985"/>
-            <wp:docPr id="6" name="Imagem 6"/>
+          <wp:inline distT="0" distB="0" distL="0" distR="0" wp14:anchorId="1734C261" wp14:editId="43053E79">
+            <wp:extent cx="4280294" cy="2752725"/>
+            <wp:effectExtent l="0" t="0" r="6350" b="0"/>
+            <wp:docPr id="1" name="Imagem 1"/>
             <wp:cNvGraphicFramePr>
               <a:graphicFrameLocks xmlns:a="http://schemas.openxmlformats.org/drawingml/2006/main" noChangeAspect="1"/>
             </wp:cNvGraphicFramePr>
@@ -1930,7 +1977,7 @@
               <a:graphicData uri="http://schemas.openxmlformats.org/drawingml/2006/picture">
                 <pic:pic xmlns:pic="http://schemas.openxmlformats.org/drawingml/2006/picture">
                   <pic:nvPicPr>
-                    <pic:cNvPr id="0" name="Picture 2"/>
+                    <pic:cNvPr id="0" name="Picture 1"/>
                     <pic:cNvPicPr>
                       <a:picLocks noChangeAspect="1" noChangeArrowheads="1"/>
                     </pic:cNvPicPr>
@@ -1951,7 +1998,7 @@
                   <pic:spPr bwMode="auto">
                     <a:xfrm>
                       <a:off x="0" y="0"/>
-                      <a:ext cx="5752465" cy="2812415"/>
+                      <a:ext cx="4286411" cy="2756659"/>
                     </a:xfrm>
                     <a:prstGeom prst="rect">
                       <a:avLst/>
@@ -4253,13 +4300,6 @@
       <w:r>
         <w:rPr>
           <w:rFonts w:cs="Arial"/>
-          <w:color w:val="000000" w:themeColor="text1"/>
-        </w:rPr>
-        <w:tab/>
-      </w:r>
-      <w:r>
-        <w:rPr>
-          <w:rFonts w:cs="Arial"/>
         </w:rPr>
         <w:t>Os requisitos se referem aos pontos</w:t>
       </w:r>
@@ -4733,17 +4773,6 @@
     </w:p>
     <w:p>
       <w:pPr>
-        <w:ind w:firstLine="567"/>
-        <w:jc w:val="center"/>
-        <w:rPr>
-          <w:rFonts w:ascii="Arial MT" w:eastAsia="Aptos" w:hAnsi="Arial MT" w:cs="Arial"/>
-          <w:color w:val="467886"/>
-          <w:u w:val="single"/>
-        </w:rPr>
-      </w:pPr>
-    </w:p>
-    <w:p>
-      <w:pPr>
         <w:jc w:val="center"/>
         <w:rPr>
           <w:rFonts w:ascii="Arial MT" w:hAnsi="Arial MT" w:cs="Arial" w:hint="eastAsia"/>
@@ -4993,21 +5022,6 @@
     </w:p>
     <w:p>
       <w:pPr>
-        <w:ind w:firstLine="567"/>
-        <w:jc w:val="both"/>
-        <w:rPr>
-          <w:rFonts w:ascii="Arial MT" w:hAnsi="Arial MT" w:cs="Arial" w:hint="eastAsia"/>
-        </w:rPr>
-      </w:pPr>
-      <w:r>
-        <w:rPr>
-          <w:rFonts w:ascii="Arial MT" w:hAnsi="Arial MT" w:cs="Arial"/>
-        </w:rPr>
-        <w:t>Aprimorando a visualização das necessidades dos clientes, foram desenvolvidas protopersonas, tratando de uma visão mais específica do perfil das personas que estão sendo objetivadas no projeto, conforme figuras 7 e 8.</w:t>
-      </w:r>
-    </w:p>
-    <w:p>
-      <w:pPr>
         <w:jc w:val="center"/>
         <w:rPr>
           <w:rFonts w:ascii="Arial MT" w:eastAsia="Aptos" w:hAnsi="Arial MT" w:cs="Arial"/>
@@ -5018,8 +5032,33 @@
     </w:p>
     <w:p>
       <w:pPr>
+        <w:ind w:firstLine="567"/>
+        <w:jc w:val="both"/>
+        <w:rPr>
+          <w:rFonts w:ascii="Arial MT" w:hAnsi="Arial MT" w:cs="Arial" w:hint="eastAsia"/>
+        </w:rPr>
+      </w:pPr>
+      <w:r>
+        <w:rPr>
+          <w:rFonts w:ascii="Arial MT" w:hAnsi="Arial MT" w:cs="Arial"/>
+        </w:rPr>
+        <w:t>Aprimorando a visualização das necessidades dos clientes, foram desenvolvidas protopersonas, tratando de uma visão mais específica do perfil das personas que estão sendo objetivadas no projeto, conforme figuras 7 e 8.</w:t>
+      </w:r>
+    </w:p>
+    <w:p>
+      <w:pPr>
         <w:jc w:val="center"/>
         <w:rPr>
+          <w:rFonts w:ascii="Arial MT" w:eastAsia="Aptos" w:hAnsi="Arial MT" w:cs="Arial"/>
+          <w:color w:val="467886"/>
+          <w:u w:val="single"/>
+        </w:rPr>
+      </w:pPr>
+    </w:p>
+    <w:p>
+      <w:pPr>
+        <w:jc w:val="center"/>
+        <w:rPr>
           <w:rFonts w:ascii="Arial MT" w:hAnsi="Arial MT" w:cs="Arial" w:hint="eastAsia"/>
           <w:b/>
           <w:bCs/>
@@ -5093,9 +5132,9 @@
           <w:color w:val="000000" w:themeColor="text1"/>
         </w:rPr>
         <w:drawing>
-          <wp:inline distT="0" distB="0" distL="0" distR="0" wp14:anchorId="4CB50E12" wp14:editId="34B04AE9">
-            <wp:extent cx="5752465" cy="3229610"/>
-            <wp:effectExtent l="0" t="0" r="635" b="8890"/>
+          <wp:inline distT="0" distB="0" distL="0" distR="0" wp14:anchorId="4CB50E12" wp14:editId="36F671EB">
+            <wp:extent cx="5600700" cy="3171825"/>
+            <wp:effectExtent l="0" t="0" r="0" b="9525"/>
             <wp:docPr id="18" name="Imagem 18"/>
             <wp:cNvGraphicFramePr>
               <a:graphicFrameLocks xmlns:a="http://schemas.openxmlformats.org/drawingml/2006/main" noChangeAspect="1"/>
@@ -5109,7 +5148,7 @@
                       <a:picLocks noChangeAspect="1" noChangeArrowheads="1"/>
                     </pic:cNvPicPr>
                   </pic:nvPicPr>
-                  <pic:blipFill>
+                  <pic:blipFill rotWithShape="1">
                     <a:blip r:embed="rId15">
                       <a:extLst>
                         <a:ext uri="{28A0092B-C50C-407E-A947-70E740481C1C}">
@@ -5117,15 +5156,13 @@
                         </a:ext>
                       </a:extLst>
                     </a:blip>
-                    <a:srcRect/>
-                    <a:stretch>
-                      <a:fillRect/>
-                    </a:stretch>
+                    <a:srcRect l="1324" r="1314" b="1789"/>
+                    <a:stretch/>
                   </pic:blipFill>
                   <pic:spPr bwMode="auto">
                     <a:xfrm>
                       <a:off x="0" y="0"/>
-                      <a:ext cx="5752465" cy="3229610"/>
+                      <a:ext cx="5600700" cy="3171825"/>
                     </a:xfrm>
                     <a:prstGeom prst="rect">
                       <a:avLst/>
@@ -5134,6 +5171,11 @@
                     <a:ln>
                       <a:noFill/>
                     </a:ln>
+                    <a:extLst>
+                      <a:ext uri="{53640926-AAD7-44D8-BBD7-CCE9431645EC}">
+                        <a14:shadowObscured xmlns:a14="http://schemas.microsoft.com/office/drawing/2010/main"/>
+                      </a:ext>
+                    </a:extLst>
                   </pic:spPr>
                 </pic:pic>
               </a:graphicData>
@@ -5378,12 +5420,11 @@
           <w:rFonts w:ascii="Arial MT" w:eastAsia="Aptos" w:hAnsi="Arial MT" w:cs="Arial"/>
           <w:noProof/>
           <w:color w:val="467886"/>
-          <w:u w:val="single"/>
         </w:rPr>
         <w:drawing>
-          <wp:inline distT="0" distB="0" distL="0" distR="0" wp14:anchorId="2BD1CC78" wp14:editId="342CFD00">
-            <wp:extent cx="5752465" cy="3229610"/>
-            <wp:effectExtent l="0" t="0" r="635" b="8890"/>
+          <wp:inline distT="0" distB="0" distL="0" distR="0" wp14:anchorId="2BD1CC78" wp14:editId="6F8CD61B">
+            <wp:extent cx="5514975" cy="3181350"/>
+            <wp:effectExtent l="0" t="0" r="9525" b="0"/>
             <wp:docPr id="19" name="Imagem 19"/>
             <wp:cNvGraphicFramePr>
               <a:graphicFrameLocks xmlns:a="http://schemas.openxmlformats.org/drawingml/2006/main" noChangeAspect="1"/>
@@ -5397,7 +5438,7 @@
                       <a:picLocks noChangeAspect="1" noChangeArrowheads="1"/>
                     </pic:cNvPicPr>
                   </pic:nvPicPr>
-                  <pic:blipFill>
+                  <pic:blipFill rotWithShape="1">
                     <a:blip r:embed="rId16">
                       <a:extLst>
                         <a:ext uri="{28A0092B-C50C-407E-A947-70E740481C1C}">
@@ -5405,15 +5446,13 @@
                         </a:ext>
                       </a:extLst>
                     </a:blip>
-                    <a:srcRect/>
-                    <a:stretch>
-                      <a:fillRect/>
-                    </a:stretch>
+                    <a:srcRect l="2318" t="-1" r="1811" b="1493"/>
+                    <a:stretch/>
                   </pic:blipFill>
                   <pic:spPr bwMode="auto">
                     <a:xfrm>
                       <a:off x="0" y="0"/>
-                      <a:ext cx="5752465" cy="3229610"/>
+                      <a:ext cx="5514975" cy="3181350"/>
                     </a:xfrm>
                     <a:prstGeom prst="rect">
                       <a:avLst/>
@@ -5422,6 +5461,11 @@
                     <a:ln>
                       <a:noFill/>
                     </a:ln>
+                    <a:extLst>
+                      <a:ext uri="{53640926-AAD7-44D8-BBD7-CCE9431645EC}">
+                        <a14:shadowObscured xmlns:a14="http://schemas.microsoft.com/office/drawing/2010/main"/>
+                      </a:ext>
+                    </a:extLst>
                   </pic:spPr>
                 </pic:pic>
               </a:graphicData>
@@ -5443,6 +5487,16 @@
         </w:rPr>
         <w:t>(Fonte: Os Autores)</w:t>
       </w:r>
+    </w:p>
+    <w:p>
+      <w:pPr>
+        <w:jc w:val="center"/>
+        <w:rPr>
+          <w:rFonts w:ascii="Arial MT" w:eastAsia="Aptos" w:hAnsi="Arial MT" w:cs="Arial"/>
+          <w:color w:val="467886"/>
+          <w:u w:val="single"/>
+        </w:rPr>
+      </w:pPr>
     </w:p>
     <w:p>
       <w:pPr>
@@ -6347,12 +6401,11 @@
           <w:rFonts w:ascii="Arial MT" w:eastAsia="Aptos" w:hAnsi="Arial MT" w:cs="Arial"/>
           <w:noProof/>
           <w:color w:val="467886"/>
-          <w:u w:val="single"/>
         </w:rPr>
         <w:drawing>
-          <wp:inline distT="0" distB="0" distL="0" distR="0" wp14:anchorId="12F0840B" wp14:editId="0CF126FE">
-            <wp:extent cx="5752465" cy="2905125"/>
-            <wp:effectExtent l="0" t="0" r="635" b="9525"/>
+          <wp:inline distT="0" distB="0" distL="0" distR="0" wp14:anchorId="12F0840B" wp14:editId="7613C5DE">
+            <wp:extent cx="5619750" cy="2781300"/>
+            <wp:effectExtent l="0" t="0" r="0" b="0"/>
             <wp:docPr id="3" name="Imagem 3"/>
             <wp:cNvGraphicFramePr>
               <a:graphicFrameLocks xmlns:a="http://schemas.openxmlformats.org/drawingml/2006/main" noChangeAspect="1"/>
@@ -6366,7 +6419,7 @@
                       <a:picLocks noChangeAspect="1" noChangeArrowheads="1"/>
                     </pic:cNvPicPr>
                   </pic:nvPicPr>
-                  <pic:blipFill>
+                  <pic:blipFill rotWithShape="1">
                     <a:blip r:embed="rId19">
                       <a:extLst>
                         <a:ext uri="{28A0092B-C50C-407E-A947-70E740481C1C}">
@@ -6374,15 +6427,13 @@
                         </a:ext>
                       </a:extLst>
                     </a:blip>
-                    <a:srcRect/>
-                    <a:stretch>
-                      <a:fillRect/>
-                    </a:stretch>
+                    <a:srcRect l="827" t="2623" r="1480" b="1639"/>
+                    <a:stretch/>
                   </pic:blipFill>
                   <pic:spPr bwMode="auto">
                     <a:xfrm>
                       <a:off x="0" y="0"/>
-                      <a:ext cx="5752465" cy="2905125"/>
+                      <a:ext cx="5619750" cy="2781300"/>
                     </a:xfrm>
                     <a:prstGeom prst="rect">
                       <a:avLst/>
@@ -6391,6 +6442,11 @@
                     <a:ln>
                       <a:noFill/>
                     </a:ln>
+                    <a:extLst>
+                      <a:ext uri="{53640926-AAD7-44D8-BBD7-CCE9431645EC}">
+                        <a14:shadowObscured xmlns:a14="http://schemas.microsoft.com/office/drawing/2010/main"/>
+                      </a:ext>
+                    </a:extLst>
                   </pic:spPr>
                 </pic:pic>
               </a:graphicData>
@@ -6536,6 +6592,16 @@
     <w:p>
       <w:pPr>
         <w:jc w:val="center"/>
+        <w:rPr>
+          <w:rFonts w:ascii="Arial MT" w:eastAsia="Aptos" w:hAnsi="Arial MT" w:cs="Arial"/>
+          <w:color w:val="467886"/>
+          <w:u w:val="single"/>
+        </w:rPr>
+      </w:pPr>
+    </w:p>
+    <w:p>
+      <w:pPr>
+        <w:jc w:val="both"/>
         <w:rPr>
           <w:rFonts w:ascii="Arial MT" w:eastAsia="Aptos" w:hAnsi="Arial MT" w:cs="Arial"/>
           <w:color w:val="467886"/>
@@ -14890,7 +14956,25 @@
           <w:kern w:val="0"/>
           <w14:ligatures w14:val="none"/>
         </w:rPr>
-        <w:t>. Disponível em: &lt;https://www.terra.com.br/noticias/vitrines-digitais-viram-novo-canal-de-midia-das-marcas,d9a4935d8634ba36be87369b1f7d032eij5isqgz.html&gt;. Acesso em: 19 fev. 2025.</w:t>
+        <w:t>. Disponível em: &lt;https://www.terra.com.br/noticias/vitrines-digitais-viram-novo-canal-de-midia-das-marcas,d9a4935d8634ba36be87369b1f7d032eij5isqgz.html&gt;. Acesso em: 19 fev. 202</w:t>
+      </w:r>
+      <w:r>
+        <w:rPr>
+          <w:rFonts w:ascii="Arial MT" w:eastAsia="Times New Roman" w:hAnsi="Arial MT" w:cs="Calibri"/>
+          <w:color w:val="000000"/>
+          <w:kern w:val="0"/>
+          <w14:ligatures w14:val="none"/>
+        </w:rPr>
+        <w:t>6</w:t>
+      </w:r>
+      <w:r>
+        <w:rPr>
+          <w:rFonts w:ascii="Arial MT" w:eastAsia="Times New Roman" w:hAnsi="Arial MT" w:cs="Calibri"/>
+          <w:color w:val="000000"/>
+          <w:kern w:val="0"/>
+          <w14:ligatures w14:val="none"/>
+        </w:rPr>
+        <w:t>.</w:t>
       </w:r>
     </w:p>
     <w:p>
@@ -16416,7 +16500,7 @@
       <w:lvlText w:val="·"/>
       <w:lvlJc w:val="left"/>
       <w:pPr>
-        <w:ind w:left="720" w:hanging="360"/>
+        <w:ind w:left="-39" w:hanging="360"/>
       </w:pPr>
       <w:rPr>
         <w:rFonts w:ascii="Symbol" w:hAnsi="Symbol" w:hint="default"/>
@@ -16428,7 +16512,7 @@
       <w:lvlText w:val="o"/>
       <w:lvlJc w:val="left"/>
       <w:pPr>
-        <w:ind w:left="1440" w:hanging="360"/>
+        <w:ind w:left="681" w:hanging="360"/>
       </w:pPr>
       <w:rPr>
         <w:rFonts w:ascii="Courier New" w:hAnsi="Courier New" w:hint="default"/>
@@ -16440,7 +16524,7 @@
       <w:lvlText w:val=""/>
       <w:lvlJc w:val="left"/>
       <w:pPr>
-        <w:ind w:left="2160" w:hanging="360"/>
+        <w:ind w:left="1401" w:hanging="360"/>
       </w:pPr>
       <w:rPr>
         <w:rFonts w:ascii="Wingdings" w:hAnsi="Wingdings" w:hint="default"/>
@@ -16452,7 +16536,7 @@
       <w:lvlText w:val=""/>
       <w:lvlJc w:val="left"/>
       <w:pPr>
-        <w:ind w:left="2880" w:hanging="360"/>
+        <w:ind w:left="2121" w:hanging="360"/>
       </w:pPr>
       <w:rPr>
         <w:rFonts w:ascii="Symbol" w:hAnsi="Symbol" w:hint="default"/>
@@ -16464,7 +16548,7 @@
       <w:lvlText w:val="o"/>
       <w:lvlJc w:val="left"/>
       <w:pPr>
-        <w:ind w:left="3600" w:hanging="360"/>
+        <w:ind w:left="2841" w:hanging="360"/>
       </w:pPr>
       <w:rPr>
         <w:rFonts w:ascii="Courier New" w:hAnsi="Courier New" w:hint="default"/>
@@ -16476,7 +16560,7 @@
       <w:lvlText w:val=""/>
       <w:lvlJc w:val="left"/>
       <w:pPr>
-        <w:ind w:left="4320" w:hanging="360"/>
+        <w:ind w:left="3561" w:hanging="360"/>
       </w:pPr>
       <w:rPr>
         <w:rFonts w:ascii="Wingdings" w:hAnsi="Wingdings" w:hint="default"/>
@@ -16488,7 +16572,7 @@
       <w:lvlText w:val=""/>
       <w:lvlJc w:val="left"/>
       <w:pPr>
-        <w:ind w:left="5040" w:hanging="360"/>
+        <w:ind w:left="4281" w:hanging="360"/>
       </w:pPr>
       <w:rPr>
         <w:rFonts w:ascii="Symbol" w:hAnsi="Symbol" w:hint="default"/>
@@ -16500,7 +16584,7 @@
       <w:lvlText w:val="o"/>
       <w:lvlJc w:val="left"/>
       <w:pPr>
-        <w:ind w:left="5760" w:hanging="360"/>
+        <w:ind w:left="5001" w:hanging="360"/>
       </w:pPr>
       <w:rPr>
         <w:rFonts w:ascii="Courier New" w:hAnsi="Courier New" w:hint="default"/>
@@ -16512,7 +16596,7 @@
       <w:lvlText w:val=""/>
       <w:lvlJc w:val="left"/>
       <w:pPr>
-        <w:ind w:left="6480" w:hanging="360"/>
+        <w:ind w:left="5721" w:hanging="360"/>
       </w:pPr>
       <w:rPr>
         <w:rFonts w:ascii="Wingdings" w:hAnsi="Wingdings" w:hint="default"/>
@@ -17842,7 +17926,7 @@
       <w:lvlText w:val=""/>
       <w:lvlJc w:val="left"/>
       <w:pPr>
-        <w:ind w:left="720" w:hanging="360"/>
+        <w:ind w:left="1068" w:hanging="360"/>
       </w:pPr>
       <w:rPr>
         <w:rFonts w:ascii="Symbol" w:hAnsi="Symbol" w:hint="default"/>
@@ -17854,7 +17938,7 @@
       <w:lvlText w:val="o"/>
       <w:lvlJc w:val="left"/>
       <w:pPr>
-        <w:ind w:left="1440" w:hanging="360"/>
+        <w:ind w:left="1788" w:hanging="360"/>
       </w:pPr>
       <w:rPr>
         <w:rFonts w:ascii="Courier New" w:hAnsi="Courier New" w:hint="default"/>
@@ -17866,7 +17950,7 @@
       <w:lvlText w:val="·"/>
       <w:lvlJc w:val="left"/>
       <w:pPr>
-        <w:ind w:left="2160" w:hanging="360"/>
+        <w:ind w:left="2508" w:hanging="360"/>
       </w:pPr>
       <w:rPr>
         <w:rFonts w:ascii="Symbol" w:hAnsi="Symbol" w:hint="default"/>
@@ -17878,7 +17962,7 @@
       <w:lvlText w:val=""/>
       <w:lvlJc w:val="left"/>
       <w:pPr>
-        <w:ind w:left="2880" w:hanging="360"/>
+        <w:ind w:left="3228" w:hanging="360"/>
       </w:pPr>
       <w:rPr>
         <w:rFonts w:ascii="Symbol" w:hAnsi="Symbol" w:hint="default"/>
@@ -17890,7 +17974,7 @@
       <w:lvlText w:val="o"/>
       <w:lvlJc w:val="left"/>
       <w:pPr>
-        <w:ind w:left="3600" w:hanging="360"/>
+        <w:ind w:left="3948" w:hanging="360"/>
       </w:pPr>
       <w:rPr>
         <w:rFonts w:ascii="Courier New" w:hAnsi="Courier New" w:hint="default"/>
@@ -17902,7 +17986,7 @@
       <w:lvlText w:val=""/>
       <w:lvlJc w:val="left"/>
       <w:pPr>
-        <w:ind w:left="4320" w:hanging="360"/>
+        <w:ind w:left="4668" w:hanging="360"/>
       </w:pPr>
       <w:rPr>
         <w:rFonts w:ascii="Wingdings" w:hAnsi="Wingdings" w:hint="default"/>
@@ -17914,7 +17998,7 @@
       <w:lvlText w:val=""/>
       <w:lvlJc w:val="left"/>
       <w:pPr>
-        <w:ind w:left="5040" w:hanging="360"/>
+        <w:ind w:left="5388" w:hanging="360"/>
       </w:pPr>
       <w:rPr>
         <w:rFonts w:ascii="Symbol" w:hAnsi="Symbol" w:hint="default"/>
@@ -17926,7 +18010,7 @@
       <w:lvlText w:val="o"/>
       <w:lvlJc w:val="left"/>
       <w:pPr>
-        <w:ind w:left="5760" w:hanging="360"/>
+        <w:ind w:left="6108" w:hanging="360"/>
       </w:pPr>
       <w:rPr>
         <w:rFonts w:ascii="Courier New" w:hAnsi="Courier New" w:hint="default"/>
@@ -17938,7 +18022,7 @@
       <w:lvlText w:val=""/>
       <w:lvlJc w:val="left"/>
       <w:pPr>
-        <w:ind w:left="6480" w:hanging="360"/>
+        <w:ind w:left="6828" w:hanging="360"/>
       </w:pPr>
       <w:rPr>
         <w:rFonts w:ascii="Wingdings" w:hAnsi="Wingdings" w:hint="default"/>

</xml_diff>

<commit_message>
Adicionando Versão 2 do Banco de Dados
</commit_message>
<xml_diff>
--- a/private/documentacao/Documentação_VOOH.docx
+++ b/private/documentacao/Documentação_VOOH.docx
@@ -1,6 +1,6 @@
 
 <file path=word/document.xml><?xml version="1.0" encoding="utf-8"?>
-<w:document xmlns:wpc="http://schemas.microsoft.com/office/word/2010/wordprocessingCanvas" xmlns:cx="http://schemas.microsoft.com/office/drawing/2014/chartex" xmlns:cx1="http://schemas.microsoft.com/office/drawing/2015/9/8/chartex" xmlns:cx2="http://schemas.microsoft.com/office/drawing/2015/10/21/chartex" xmlns:cx3="http://schemas.microsoft.com/office/drawing/2016/5/9/chartex" xmlns:cx4="http://schemas.microsoft.com/office/drawing/2016/5/10/chartex" xmlns:cx5="http://schemas.microsoft.com/office/drawing/2016/5/11/chartex" xmlns:cx6="http://schemas.microsoft.com/office/drawing/2016/5/12/chartex" xmlns:cx7="http://schemas.microsoft.com/office/drawing/2016/5/13/chartex" xmlns:cx8="http://schemas.microsoft.com/office/drawing/2016/5/14/chartex" xmlns:mc="http://schemas.openxmlformats.org/markup-compatibility/2006" xmlns:aink="http://schemas.microsoft.com/office/drawing/2016/ink" xmlns:am3d="http://schemas.microsoft.com/office/drawing/2017/model3d" xmlns:o="urn:schemas-microsoft-com:office:office" xmlns:r="http://schemas.openxmlformats.org/officeDocument/2006/relationships" xmlns:m="http://schemas.openxmlformats.org/officeDocument/2006/math" xmlns:v="urn:schemas-microsoft-com:vml" xmlns:wp14="http://schemas.microsoft.com/office/word/2010/wordprocessingDrawing" xmlns:wp="http://schemas.openxmlformats.org/drawingml/2006/wordprocessingDrawing" xmlns:w10="urn:schemas-microsoft-com:office:word" xmlns:w="http://schemas.openxmlformats.org/wordprocessingml/2006/main" xmlns:w14="http://schemas.microsoft.com/office/word/2010/wordml" xmlns:w15="http://schemas.microsoft.com/office/word/2012/wordml" xmlns:w16cex="http://schemas.microsoft.com/office/word/2018/wordml/cex" xmlns:w16cid="http://schemas.microsoft.com/office/word/2016/wordml/cid" xmlns:w16="http://schemas.microsoft.com/office/word/2018/wordml" xmlns:w16sdtdh="http://schemas.microsoft.com/office/word/2020/wordml/sdtdatahash" xmlns:w16se="http://schemas.microsoft.com/office/word/2015/wordml/symex" xmlns:wpg="http://schemas.microsoft.com/office/word/2010/wordprocessingGroup" xmlns:wpi="http://schemas.microsoft.com/office/word/2010/wordprocessingInk" xmlns:wne="http://schemas.microsoft.com/office/word/2006/wordml" xmlns:wps="http://schemas.microsoft.com/office/word/2010/wordprocessingShape" mc:Ignorable="w14 w15 w16se w16cid w16 w16cex w16sdtdh wp14">
+<w:document xmlns:wpc="http://schemas.microsoft.com/office/word/2010/wordprocessingCanvas" xmlns:cx="http://schemas.microsoft.com/office/drawing/2014/chartex" xmlns:cx1="http://schemas.microsoft.com/office/drawing/2015/9/8/chartex" xmlns:cx2="http://schemas.microsoft.com/office/drawing/2015/10/21/chartex" xmlns:cx3="http://schemas.microsoft.com/office/drawing/2016/5/9/chartex" xmlns:cx4="http://schemas.microsoft.com/office/drawing/2016/5/10/chartex" xmlns:cx5="http://schemas.microsoft.com/office/drawing/2016/5/11/chartex" xmlns:cx6="http://schemas.microsoft.com/office/drawing/2016/5/12/chartex" xmlns:cx7="http://schemas.microsoft.com/office/drawing/2016/5/13/chartex" xmlns:cx8="http://schemas.microsoft.com/office/drawing/2016/5/14/chartex" xmlns:mc="http://schemas.openxmlformats.org/markup-compatibility/2006" xmlns:aink="http://schemas.microsoft.com/office/drawing/2016/ink" xmlns:am3d="http://schemas.microsoft.com/office/drawing/2017/model3d" xmlns:o="urn:schemas-microsoft-com:office:office" xmlns:oel="http://schemas.microsoft.com/office/2019/extlst" xmlns:r="http://schemas.openxmlformats.org/officeDocument/2006/relationships" xmlns:m="http://schemas.openxmlformats.org/officeDocument/2006/math" xmlns:v="urn:schemas-microsoft-com:vml" xmlns:wp14="http://schemas.microsoft.com/office/word/2010/wordprocessingDrawing" xmlns:wp="http://schemas.openxmlformats.org/drawingml/2006/wordprocessingDrawing" xmlns:w10="urn:schemas-microsoft-com:office:word" xmlns:w="http://schemas.openxmlformats.org/wordprocessingml/2006/main" xmlns:w14="http://schemas.microsoft.com/office/word/2010/wordml" xmlns:w15="http://schemas.microsoft.com/office/word/2012/wordml" xmlns:w16cex="http://schemas.microsoft.com/office/word/2018/wordml/cex" xmlns:w16cid="http://schemas.microsoft.com/office/word/2016/wordml/cid" xmlns:w16="http://schemas.microsoft.com/office/word/2018/wordml" xmlns:w16du="http://schemas.microsoft.com/office/word/2023/wordml/word16du" xmlns:w16sdtdh="http://schemas.microsoft.com/office/word/2020/wordml/sdtdatahash" xmlns:w16sdtfl="http://schemas.microsoft.com/office/word/2024/wordml/sdtformatlock" xmlns:w16se="http://schemas.microsoft.com/office/word/2015/wordml/symex" xmlns:wpg="http://schemas.microsoft.com/office/word/2010/wordprocessingGroup" xmlns:wpi="http://schemas.microsoft.com/office/word/2010/wordprocessingInk" xmlns:wne="http://schemas.microsoft.com/office/word/2006/wordml" xmlns:wps="http://schemas.microsoft.com/office/word/2010/wordprocessingShape" mc:Ignorable="w14 w15 w16se w16cid w16 w16cex w16sdtdh w16sdtfl w16du wp14">
   <w:body>
     <w:p>
       <w:pPr>
@@ -70,21 +70,12 @@
           <w:color w:val="000000" w:themeColor="text1"/>
         </w:rPr>
       </w:pPr>
-      <w:proofErr w:type="spellStart"/>
       <w:r>
         <w:rPr>
           <w:rFonts w:ascii="Arial MT" w:hAnsi="Arial MT" w:cs="Arial"/>
           <w:color w:val="000000" w:themeColor="text1"/>
         </w:rPr>
-        <w:t>Kauan</w:t>
-      </w:r>
-      <w:proofErr w:type="spellEnd"/>
-      <w:r>
-        <w:rPr>
-          <w:rFonts w:ascii="Arial MT" w:hAnsi="Arial MT" w:cs="Arial"/>
-          <w:color w:val="000000" w:themeColor="text1"/>
-        </w:rPr>
-        <w:t xml:space="preserve"> Alessandro </w:t>
+        <w:t xml:space="preserve">Kauan Alessandro </w:t>
       </w:r>
       <w:proofErr w:type="spellStart"/>
       <w:r>
@@ -161,23 +152,7 @@
           <w:rFonts w:ascii="Arial MT" w:hAnsi="Arial MT" w:cs="Arial"/>
           <w:color w:val="000000" w:themeColor="text1"/>
         </w:rPr>
-        <w:t xml:space="preserve"> </w:t>
-      </w:r>
-      <w:proofErr w:type="spellStart"/>
-      <w:r>
-        <w:rPr>
-          <w:rFonts w:ascii="Arial MT" w:hAnsi="Arial MT" w:cs="Arial"/>
-          <w:color w:val="000000" w:themeColor="text1"/>
-        </w:rPr>
-        <w:t>Yogi</w:t>
-      </w:r>
-      <w:proofErr w:type="spellEnd"/>
-      <w:r>
-        <w:rPr>
-          <w:rFonts w:ascii="Arial MT" w:hAnsi="Arial MT" w:cs="Arial"/>
-          <w:color w:val="000000" w:themeColor="text1"/>
-        </w:rPr>
-        <w:t xml:space="preserve"> Carvalho</w:t>
+        <w:t xml:space="preserve"> Yogi Carvalho</w:t>
       </w:r>
     </w:p>
     <w:p>
@@ -375,8 +350,6 @@
     </w:p>
     <w:p>
       <w:pPr>
-        <w:ind w:left="-567"/>
-        <w:jc w:val="center"/>
         <w:rPr>
           <w:rFonts w:ascii="Arial MT" w:hAnsi="Arial MT" w:cs="Arial" w:hint="eastAsia"/>
           <w:color w:val="000000" w:themeColor="text1"/>
@@ -1844,7 +1817,7 @@
         <w:ind w:firstLine="708"/>
         <w:jc w:val="both"/>
         <w:rPr>
-          <w:rFonts w:ascii="Arial MT" w:hAnsi="Arial MT" w:cs="Arial"/>
+          <w:rFonts w:ascii="Arial MT" w:hAnsi="Arial MT" w:cs="Arial" w:hint="eastAsia"/>
         </w:rPr>
       </w:pPr>
       <w:r>
@@ -4637,6 +4610,7 @@
         </w:rPr>
         <w:t xml:space="preserve"> – </w:t>
       </w:r>
+      <w:proofErr w:type="spellStart"/>
       <w:r>
         <w:rPr>
           <w:rFonts w:ascii="Arial MT" w:hAnsi="Arial MT" w:cs="Arial"/>
@@ -4644,9 +4618,9 @@
           <w:bCs/>
           <w:color w:val="000000" w:themeColor="text1"/>
         </w:rPr>
-        <w:t xml:space="preserve">User </w:t>
-      </w:r>
-      <w:proofErr w:type="spellStart"/>
+        <w:t>User</w:t>
+      </w:r>
+      <w:proofErr w:type="spellEnd"/>
       <w:r>
         <w:rPr>
           <w:rFonts w:ascii="Arial MT" w:hAnsi="Arial MT" w:cs="Arial"/>
@@ -4654,17 +4628,7 @@
           <w:bCs/>
           <w:color w:val="000000" w:themeColor="text1"/>
         </w:rPr>
-        <w:t>Story</w:t>
-      </w:r>
-      <w:proofErr w:type="spellEnd"/>
-      <w:r>
-        <w:rPr>
-          <w:rFonts w:ascii="Arial MT" w:hAnsi="Arial MT" w:cs="Arial"/>
-          <w:b/>
-          <w:bCs/>
-          <w:color w:val="000000" w:themeColor="text1"/>
-        </w:rPr>
-        <w:t xml:space="preserve"> da Alice, uma gerente de NOC</w:t>
+        <w:t xml:space="preserve"> Story da Alice, uma gerente de NOC</w:t>
       </w:r>
     </w:p>
     <w:p>
@@ -4808,6 +4772,7 @@
         </w:rPr>
         <w:t xml:space="preserve"> – </w:t>
       </w:r>
+      <w:proofErr w:type="spellStart"/>
       <w:r>
         <w:rPr>
           <w:rFonts w:ascii="Arial MT" w:hAnsi="Arial MT" w:cs="Arial"/>
@@ -4815,9 +4780,9 @@
           <w:bCs/>
           <w:color w:val="000000" w:themeColor="text1"/>
         </w:rPr>
-        <w:t xml:space="preserve">User </w:t>
-      </w:r>
-      <w:proofErr w:type="spellStart"/>
+        <w:t>User</w:t>
+      </w:r>
+      <w:proofErr w:type="spellEnd"/>
       <w:r>
         <w:rPr>
           <w:rFonts w:ascii="Arial MT" w:hAnsi="Arial MT" w:cs="Arial"/>
@@ -4825,37 +4790,7 @@
           <w:bCs/>
           <w:color w:val="000000" w:themeColor="text1"/>
         </w:rPr>
-        <w:t>Story</w:t>
-      </w:r>
-      <w:proofErr w:type="spellEnd"/>
-      <w:r>
-        <w:rPr>
-          <w:rFonts w:ascii="Arial MT" w:hAnsi="Arial MT" w:cs="Arial"/>
-          <w:b/>
-          <w:bCs/>
-          <w:color w:val="000000" w:themeColor="text1"/>
-        </w:rPr>
-        <w:t xml:space="preserve"> do </w:t>
-      </w:r>
-      <w:proofErr w:type="spellStart"/>
-      <w:r>
-        <w:rPr>
-          <w:rFonts w:ascii="Arial MT" w:hAnsi="Arial MT" w:cs="Arial"/>
-          <w:b/>
-          <w:bCs/>
-          <w:color w:val="000000" w:themeColor="text1"/>
-        </w:rPr>
-        <w:t>Jerson</w:t>
-      </w:r>
-      <w:proofErr w:type="spellEnd"/>
-      <w:r>
-        <w:rPr>
-          <w:rFonts w:ascii="Arial MT" w:hAnsi="Arial MT" w:cs="Arial"/>
-          <w:b/>
-          <w:bCs/>
-          <w:color w:val="000000" w:themeColor="text1"/>
-        </w:rPr>
-        <w:t>, um analista de dados e insights</w:t>
+        <w:t xml:space="preserve"> Story do Jerson, um analista de dados e insights</w:t>
       </w:r>
     </w:p>
     <w:p>
@@ -5383,27 +5318,7 @@
           <w:bCs/>
           <w:color w:val="000000" w:themeColor="text1"/>
         </w:rPr>
-        <w:t xml:space="preserve"> / Mapa de Usuário do </w:t>
-      </w:r>
-      <w:proofErr w:type="spellStart"/>
-      <w:r>
-        <w:rPr>
-          <w:rFonts w:ascii="Arial MT" w:hAnsi="Arial MT" w:cs="Arial"/>
-          <w:b/>
-          <w:bCs/>
-          <w:color w:val="000000" w:themeColor="text1"/>
-        </w:rPr>
-        <w:t>Jerson</w:t>
-      </w:r>
-      <w:proofErr w:type="spellEnd"/>
-      <w:r>
-        <w:rPr>
-          <w:rFonts w:ascii="Arial MT" w:hAnsi="Arial MT" w:cs="Arial"/>
-          <w:b/>
-          <w:bCs/>
-          <w:color w:val="000000" w:themeColor="text1"/>
-        </w:rPr>
-        <w:t>, um analista de dados e insights</w:t>
+        <w:t xml:space="preserve"> / Mapa de Usuário do Jerson, um analista de dados e insights</w:t>
       </w:r>
     </w:p>
     <w:p>
@@ -6704,27 +6619,7 @@
           <w:bCs/>
           <w:color w:val="000000" w:themeColor="text1"/>
         </w:rPr>
-        <w:t xml:space="preserve">Lean UX </w:t>
-      </w:r>
-      <w:proofErr w:type="spellStart"/>
-      <w:r>
-        <w:rPr>
-          <w:rFonts w:ascii="Arial MT" w:hAnsi="Arial MT" w:cs="Arial"/>
-          <w:b/>
-          <w:bCs/>
-          <w:color w:val="000000" w:themeColor="text1"/>
-        </w:rPr>
-        <w:t>Canvas</w:t>
-      </w:r>
-      <w:proofErr w:type="spellEnd"/>
-      <w:r>
-        <w:rPr>
-          <w:rFonts w:ascii="Arial MT" w:hAnsi="Arial MT" w:cs="Arial"/>
-          <w:b/>
-          <w:bCs/>
-          <w:color w:val="000000" w:themeColor="text1"/>
-        </w:rPr>
-        <w:t xml:space="preserve"> contendo </w:t>
+        <w:t xml:space="preserve">Lean UX Canvas contendo </w:t>
       </w:r>
       <w:r>
         <w:rPr>
@@ -7724,19 +7619,8 @@
           <w:bCs/>
           <w:color w:val="000000" w:themeColor="text1"/>
         </w:rPr>
-        <w:t xml:space="preserve">Ferramenta </w:t>
-      </w:r>
-      <w:proofErr w:type="spellStart"/>
-      <w:r>
-        <w:rPr>
-          <w:rFonts w:ascii="Arial MT" w:hAnsi="Arial MT" w:cs="Arial"/>
-          <w:b/>
-          <w:bCs/>
-          <w:color w:val="000000" w:themeColor="text1"/>
-        </w:rPr>
-        <w:t>Github</w:t>
-      </w:r>
-      <w:proofErr w:type="spellEnd"/>
+        <w:t>Ferramenta Github</w:t>
+      </w:r>
     </w:p>
     <w:p>
       <w:pPr>
@@ -8775,7 +8659,6 @@
               <w:widowControl w:val="0"/>
               <w:spacing w:before="120" w:after="120" w:line="360" w:lineRule="auto"/>
               <w:jc w:val="center"/>
-              <w:outlineLvl w:val="1"/>
               <w:rPr>
                 <w:rFonts w:ascii="Arial MT" w:eastAsia="Arial" w:hAnsi="Arial MT" w:cs="Arial"/>
                 <w:color w:val="FFFFFF" w:themeColor="background1"/>
@@ -8825,7 +8708,6 @@
               <w:widowControl w:val="0"/>
               <w:spacing w:before="120" w:after="120" w:line="360" w:lineRule="auto"/>
               <w:jc w:val="center"/>
-              <w:outlineLvl w:val="1"/>
               <w:rPr>
                 <w:rFonts w:ascii="Arial MT" w:eastAsia="Arial" w:hAnsi="Arial MT" w:cs="Arial"/>
                 <w:color w:val="FFFFFF" w:themeColor="background1"/>
@@ -8870,7 +8752,6 @@
               <w:widowControl w:val="0"/>
               <w:spacing w:before="120" w:after="120" w:line="360" w:lineRule="auto"/>
               <w:jc w:val="center"/>
-              <w:outlineLvl w:val="1"/>
               <w:rPr>
                 <w:rFonts w:ascii="Arial MT" w:eastAsia="Arial" w:hAnsi="Arial MT" w:cs="Arial"/>
                 <w:color w:val="FFFFFF" w:themeColor="background1"/>
@@ -14143,31 +14024,7 @@
           <w:kern w:val="0"/>
           <w14:ligatures w14:val="none"/>
         </w:rPr>
-        <w:t xml:space="preserve">, </w:t>
-      </w:r>
-      <w:proofErr w:type="spellStart"/>
-      <w:r>
-        <w:rPr>
-          <w:rFonts w:ascii="Arial MT" w:eastAsia="Times New Roman" w:hAnsi="Arial MT" w:cs="Calibri"/>
-          <w:b/>
-          <w:bCs/>
-          <w:color w:val="000000"/>
-          <w:kern w:val="0"/>
-          <w14:ligatures w14:val="none"/>
-        </w:rPr>
-        <w:t>Report</w:t>
-      </w:r>
-      <w:proofErr w:type="spellEnd"/>
-      <w:r>
-        <w:rPr>
-          <w:rFonts w:ascii="Arial MT" w:eastAsia="Times New Roman" w:hAnsi="Arial MT" w:cs="Calibri"/>
-          <w:b/>
-          <w:bCs/>
-          <w:color w:val="000000"/>
-          <w:kern w:val="0"/>
-          <w14:ligatures w14:val="none"/>
-        </w:rPr>
-        <w:t xml:space="preserve"> </w:t>
+        <w:t xml:space="preserve">, Report </w:t>
       </w:r>
       <w:proofErr w:type="spellStart"/>
       <w:r>
@@ -15022,7 +14879,7 @@
 </file>
 
 <file path=word/endnotes.xml><?xml version="1.0" encoding="utf-8"?>
-<w:endnotes xmlns:wpc="http://schemas.microsoft.com/office/word/2010/wordprocessingCanvas" xmlns:cx="http://schemas.microsoft.com/office/drawing/2014/chartex" xmlns:cx1="http://schemas.microsoft.com/office/drawing/2015/9/8/chartex" xmlns:cx2="http://schemas.microsoft.com/office/drawing/2015/10/21/chartex" xmlns:cx3="http://schemas.microsoft.com/office/drawing/2016/5/9/chartex" xmlns:cx4="http://schemas.microsoft.com/office/drawing/2016/5/10/chartex" xmlns:cx5="http://schemas.microsoft.com/office/drawing/2016/5/11/chartex" xmlns:cx6="http://schemas.microsoft.com/office/drawing/2016/5/12/chartex" xmlns:cx7="http://schemas.microsoft.com/office/drawing/2016/5/13/chartex" xmlns:cx8="http://schemas.microsoft.com/office/drawing/2016/5/14/chartex" xmlns:mc="http://schemas.openxmlformats.org/markup-compatibility/2006" xmlns:aink="http://schemas.microsoft.com/office/drawing/2016/ink" xmlns:am3d="http://schemas.microsoft.com/office/drawing/2017/model3d" xmlns:o="urn:schemas-microsoft-com:office:office" xmlns:r="http://schemas.openxmlformats.org/officeDocument/2006/relationships" xmlns:m="http://schemas.openxmlformats.org/officeDocument/2006/math" xmlns:v="urn:schemas-microsoft-com:vml" xmlns:wp14="http://schemas.microsoft.com/office/word/2010/wordprocessingDrawing" xmlns:wp="http://schemas.openxmlformats.org/drawingml/2006/wordprocessingDrawing" xmlns:w10="urn:schemas-microsoft-com:office:word" xmlns:w="http://schemas.openxmlformats.org/wordprocessingml/2006/main" xmlns:w14="http://schemas.microsoft.com/office/word/2010/wordml" xmlns:w15="http://schemas.microsoft.com/office/word/2012/wordml" xmlns:w16cex="http://schemas.microsoft.com/office/word/2018/wordml/cex" xmlns:w16cid="http://schemas.microsoft.com/office/word/2016/wordml/cid" xmlns:w16="http://schemas.microsoft.com/office/word/2018/wordml" xmlns:w16sdtdh="http://schemas.microsoft.com/office/word/2020/wordml/sdtdatahash" xmlns:w16se="http://schemas.microsoft.com/office/word/2015/wordml/symex" xmlns:wpg="http://schemas.microsoft.com/office/word/2010/wordprocessingGroup" xmlns:wpi="http://schemas.microsoft.com/office/word/2010/wordprocessingInk" xmlns:wne="http://schemas.microsoft.com/office/word/2006/wordml" xmlns:wps="http://schemas.microsoft.com/office/word/2010/wordprocessingShape" mc:Ignorable="w14 w15 w16se w16cid w16 w16cex w16sdtdh wp14">
+<w:endnotes xmlns:wpc="http://schemas.microsoft.com/office/word/2010/wordprocessingCanvas" xmlns:cx="http://schemas.microsoft.com/office/drawing/2014/chartex" xmlns:cx1="http://schemas.microsoft.com/office/drawing/2015/9/8/chartex" xmlns:cx2="http://schemas.microsoft.com/office/drawing/2015/10/21/chartex" xmlns:cx3="http://schemas.microsoft.com/office/drawing/2016/5/9/chartex" xmlns:cx4="http://schemas.microsoft.com/office/drawing/2016/5/10/chartex" xmlns:cx5="http://schemas.microsoft.com/office/drawing/2016/5/11/chartex" xmlns:cx6="http://schemas.microsoft.com/office/drawing/2016/5/12/chartex" xmlns:cx7="http://schemas.microsoft.com/office/drawing/2016/5/13/chartex" xmlns:cx8="http://schemas.microsoft.com/office/drawing/2016/5/14/chartex" xmlns:mc="http://schemas.openxmlformats.org/markup-compatibility/2006" xmlns:aink="http://schemas.microsoft.com/office/drawing/2016/ink" xmlns:am3d="http://schemas.microsoft.com/office/drawing/2017/model3d" xmlns:o="urn:schemas-microsoft-com:office:office" xmlns:oel="http://schemas.microsoft.com/office/2019/extlst" xmlns:r="http://schemas.openxmlformats.org/officeDocument/2006/relationships" xmlns:m="http://schemas.openxmlformats.org/officeDocument/2006/math" xmlns:v="urn:schemas-microsoft-com:vml" xmlns:wp14="http://schemas.microsoft.com/office/word/2010/wordprocessingDrawing" xmlns:wp="http://schemas.openxmlformats.org/drawingml/2006/wordprocessingDrawing" xmlns:w10="urn:schemas-microsoft-com:office:word" xmlns:w="http://schemas.openxmlformats.org/wordprocessingml/2006/main" xmlns:w14="http://schemas.microsoft.com/office/word/2010/wordml" xmlns:w15="http://schemas.microsoft.com/office/word/2012/wordml" xmlns:w16cex="http://schemas.microsoft.com/office/word/2018/wordml/cex" xmlns:w16cid="http://schemas.microsoft.com/office/word/2016/wordml/cid" xmlns:w16="http://schemas.microsoft.com/office/word/2018/wordml" xmlns:w16du="http://schemas.microsoft.com/office/word/2023/wordml/word16du" xmlns:w16sdtdh="http://schemas.microsoft.com/office/word/2020/wordml/sdtdatahash" xmlns:w16sdtfl="http://schemas.microsoft.com/office/word/2024/wordml/sdtformatlock" xmlns:w16se="http://schemas.microsoft.com/office/word/2015/wordml/symex" xmlns:wpg="http://schemas.microsoft.com/office/word/2010/wordprocessingGroup" xmlns:wpi="http://schemas.microsoft.com/office/word/2010/wordprocessingInk" xmlns:wne="http://schemas.microsoft.com/office/word/2006/wordml" xmlns:wps="http://schemas.microsoft.com/office/word/2010/wordprocessingShape" mc:Ignorable="w14 w15 w16se w16cid w16 w16cex w16sdtdh w16sdtfl w16du wp14">
   <w:endnote w:type="separator" w:id="-1">
     <w:p>
       <w:pPr>
@@ -15047,7 +14904,7 @@
 </file>
 
 <file path=word/footnotes.xml><?xml version="1.0" encoding="utf-8"?>
-<w:footnotes xmlns:wpc="http://schemas.microsoft.com/office/word/2010/wordprocessingCanvas" xmlns:cx="http://schemas.microsoft.com/office/drawing/2014/chartex" xmlns:cx1="http://schemas.microsoft.com/office/drawing/2015/9/8/chartex" xmlns:cx2="http://schemas.microsoft.com/office/drawing/2015/10/21/chartex" xmlns:cx3="http://schemas.microsoft.com/office/drawing/2016/5/9/chartex" xmlns:cx4="http://schemas.microsoft.com/office/drawing/2016/5/10/chartex" xmlns:cx5="http://schemas.microsoft.com/office/drawing/2016/5/11/chartex" xmlns:cx6="http://schemas.microsoft.com/office/drawing/2016/5/12/chartex" xmlns:cx7="http://schemas.microsoft.com/office/drawing/2016/5/13/chartex" xmlns:cx8="http://schemas.microsoft.com/office/drawing/2016/5/14/chartex" xmlns:mc="http://schemas.openxmlformats.org/markup-compatibility/2006" xmlns:aink="http://schemas.microsoft.com/office/drawing/2016/ink" xmlns:am3d="http://schemas.microsoft.com/office/drawing/2017/model3d" xmlns:o="urn:schemas-microsoft-com:office:office" xmlns:r="http://schemas.openxmlformats.org/officeDocument/2006/relationships" xmlns:m="http://schemas.openxmlformats.org/officeDocument/2006/math" xmlns:v="urn:schemas-microsoft-com:vml" xmlns:wp14="http://schemas.microsoft.com/office/word/2010/wordprocessingDrawing" xmlns:wp="http://schemas.openxmlformats.org/drawingml/2006/wordprocessingDrawing" xmlns:w10="urn:schemas-microsoft-com:office:word" xmlns:w="http://schemas.openxmlformats.org/wordprocessingml/2006/main" xmlns:w14="http://schemas.microsoft.com/office/word/2010/wordml" xmlns:w15="http://schemas.microsoft.com/office/word/2012/wordml" xmlns:w16cex="http://schemas.microsoft.com/office/word/2018/wordml/cex" xmlns:w16cid="http://schemas.microsoft.com/office/word/2016/wordml/cid" xmlns:w16="http://schemas.microsoft.com/office/word/2018/wordml" xmlns:w16sdtdh="http://schemas.microsoft.com/office/word/2020/wordml/sdtdatahash" xmlns:w16se="http://schemas.microsoft.com/office/word/2015/wordml/symex" xmlns:wpg="http://schemas.microsoft.com/office/word/2010/wordprocessingGroup" xmlns:wpi="http://schemas.microsoft.com/office/word/2010/wordprocessingInk" xmlns:wne="http://schemas.microsoft.com/office/word/2006/wordml" xmlns:wps="http://schemas.microsoft.com/office/word/2010/wordprocessingShape" mc:Ignorable="w14 w15 w16se w16cid w16 w16cex w16sdtdh wp14">
+<w:footnotes xmlns:wpc="http://schemas.microsoft.com/office/word/2010/wordprocessingCanvas" xmlns:cx="http://schemas.microsoft.com/office/drawing/2014/chartex" xmlns:cx1="http://schemas.microsoft.com/office/drawing/2015/9/8/chartex" xmlns:cx2="http://schemas.microsoft.com/office/drawing/2015/10/21/chartex" xmlns:cx3="http://schemas.microsoft.com/office/drawing/2016/5/9/chartex" xmlns:cx4="http://schemas.microsoft.com/office/drawing/2016/5/10/chartex" xmlns:cx5="http://schemas.microsoft.com/office/drawing/2016/5/11/chartex" xmlns:cx6="http://schemas.microsoft.com/office/drawing/2016/5/12/chartex" xmlns:cx7="http://schemas.microsoft.com/office/drawing/2016/5/13/chartex" xmlns:cx8="http://schemas.microsoft.com/office/drawing/2016/5/14/chartex" xmlns:mc="http://schemas.openxmlformats.org/markup-compatibility/2006" xmlns:aink="http://schemas.microsoft.com/office/drawing/2016/ink" xmlns:am3d="http://schemas.microsoft.com/office/drawing/2017/model3d" xmlns:o="urn:schemas-microsoft-com:office:office" xmlns:oel="http://schemas.microsoft.com/office/2019/extlst" xmlns:r="http://schemas.openxmlformats.org/officeDocument/2006/relationships" xmlns:m="http://schemas.openxmlformats.org/officeDocument/2006/math" xmlns:v="urn:schemas-microsoft-com:vml" xmlns:wp14="http://schemas.microsoft.com/office/word/2010/wordprocessingDrawing" xmlns:wp="http://schemas.openxmlformats.org/drawingml/2006/wordprocessingDrawing" xmlns:w10="urn:schemas-microsoft-com:office:word" xmlns:w="http://schemas.openxmlformats.org/wordprocessingml/2006/main" xmlns:w14="http://schemas.microsoft.com/office/word/2010/wordml" xmlns:w15="http://schemas.microsoft.com/office/word/2012/wordml" xmlns:w16cex="http://schemas.microsoft.com/office/word/2018/wordml/cex" xmlns:w16cid="http://schemas.microsoft.com/office/word/2016/wordml/cid" xmlns:w16="http://schemas.microsoft.com/office/word/2018/wordml" xmlns:w16du="http://schemas.microsoft.com/office/word/2023/wordml/word16du" xmlns:w16sdtdh="http://schemas.microsoft.com/office/word/2020/wordml/sdtdatahash" xmlns:w16sdtfl="http://schemas.microsoft.com/office/word/2024/wordml/sdtformatlock" xmlns:w16se="http://schemas.microsoft.com/office/word/2015/wordml/symex" xmlns:wpg="http://schemas.microsoft.com/office/word/2010/wordprocessingGroup" xmlns:wpi="http://schemas.microsoft.com/office/word/2010/wordprocessingInk" xmlns:wne="http://schemas.microsoft.com/office/word/2006/wordml" xmlns:wps="http://schemas.microsoft.com/office/word/2010/wordprocessingShape" mc:Ignorable="w14 w15 w16se w16cid w16 w16cex w16sdtdh w16sdtfl w16du wp14">
   <w:footnote w:type="separator" w:id="-1">
     <w:p>
       <w:pPr>
@@ -15072,7 +14929,7 @@
 </file>
 
 <file path=word/header1.xml><?xml version="1.0" encoding="utf-8"?>
-<w:hdr xmlns:wpc="http://schemas.microsoft.com/office/word/2010/wordprocessingCanvas" xmlns:cx="http://schemas.microsoft.com/office/drawing/2014/chartex" xmlns:cx1="http://schemas.microsoft.com/office/drawing/2015/9/8/chartex" xmlns:cx2="http://schemas.microsoft.com/office/drawing/2015/10/21/chartex" xmlns:cx3="http://schemas.microsoft.com/office/drawing/2016/5/9/chartex" xmlns:cx4="http://schemas.microsoft.com/office/drawing/2016/5/10/chartex" xmlns:cx5="http://schemas.microsoft.com/office/drawing/2016/5/11/chartex" xmlns:cx6="http://schemas.microsoft.com/office/drawing/2016/5/12/chartex" xmlns:cx7="http://schemas.microsoft.com/office/drawing/2016/5/13/chartex" xmlns:cx8="http://schemas.microsoft.com/office/drawing/2016/5/14/chartex" xmlns:mc="http://schemas.openxmlformats.org/markup-compatibility/2006" xmlns:aink="http://schemas.microsoft.com/office/drawing/2016/ink" xmlns:am3d="http://schemas.microsoft.com/office/drawing/2017/model3d" xmlns:o="urn:schemas-microsoft-com:office:office" xmlns:r="http://schemas.openxmlformats.org/officeDocument/2006/relationships" xmlns:m="http://schemas.openxmlformats.org/officeDocument/2006/math" xmlns:v="urn:schemas-microsoft-com:vml" xmlns:wp14="http://schemas.microsoft.com/office/word/2010/wordprocessingDrawing" xmlns:wp="http://schemas.openxmlformats.org/drawingml/2006/wordprocessingDrawing" xmlns:w10="urn:schemas-microsoft-com:office:word" xmlns:w="http://schemas.openxmlformats.org/wordprocessingml/2006/main" xmlns:w14="http://schemas.microsoft.com/office/word/2010/wordml" xmlns:w15="http://schemas.microsoft.com/office/word/2012/wordml" xmlns:w16cex="http://schemas.microsoft.com/office/word/2018/wordml/cex" xmlns:w16cid="http://schemas.microsoft.com/office/word/2016/wordml/cid" xmlns:w16="http://schemas.microsoft.com/office/word/2018/wordml" xmlns:w16sdtdh="http://schemas.microsoft.com/office/word/2020/wordml/sdtdatahash" xmlns:w16se="http://schemas.microsoft.com/office/word/2015/wordml/symex" xmlns:wpg="http://schemas.microsoft.com/office/word/2010/wordprocessingGroup" xmlns:wpi="http://schemas.microsoft.com/office/word/2010/wordprocessingInk" xmlns:wne="http://schemas.microsoft.com/office/word/2006/wordml" xmlns:wps="http://schemas.microsoft.com/office/word/2010/wordprocessingShape" mc:Ignorable="w14 w15 w16se w16cid w16 w16cex w16sdtdh wp14">
+<w:hdr xmlns:wpc="http://schemas.microsoft.com/office/word/2010/wordprocessingCanvas" xmlns:cx="http://schemas.microsoft.com/office/drawing/2014/chartex" xmlns:cx1="http://schemas.microsoft.com/office/drawing/2015/9/8/chartex" xmlns:cx2="http://schemas.microsoft.com/office/drawing/2015/10/21/chartex" xmlns:cx3="http://schemas.microsoft.com/office/drawing/2016/5/9/chartex" xmlns:cx4="http://schemas.microsoft.com/office/drawing/2016/5/10/chartex" xmlns:cx5="http://schemas.microsoft.com/office/drawing/2016/5/11/chartex" xmlns:cx6="http://schemas.microsoft.com/office/drawing/2016/5/12/chartex" xmlns:cx7="http://schemas.microsoft.com/office/drawing/2016/5/13/chartex" xmlns:cx8="http://schemas.microsoft.com/office/drawing/2016/5/14/chartex" xmlns:mc="http://schemas.openxmlformats.org/markup-compatibility/2006" xmlns:aink="http://schemas.microsoft.com/office/drawing/2016/ink" xmlns:am3d="http://schemas.microsoft.com/office/drawing/2017/model3d" xmlns:o="urn:schemas-microsoft-com:office:office" xmlns:oel="http://schemas.microsoft.com/office/2019/extlst" xmlns:r="http://schemas.openxmlformats.org/officeDocument/2006/relationships" xmlns:m="http://schemas.openxmlformats.org/officeDocument/2006/math" xmlns:v="urn:schemas-microsoft-com:vml" xmlns:wp14="http://schemas.microsoft.com/office/word/2010/wordprocessingDrawing" xmlns:wp="http://schemas.openxmlformats.org/drawingml/2006/wordprocessingDrawing" xmlns:w10="urn:schemas-microsoft-com:office:word" xmlns:w="http://schemas.openxmlformats.org/wordprocessingml/2006/main" xmlns:w14="http://schemas.microsoft.com/office/word/2010/wordml" xmlns:w15="http://schemas.microsoft.com/office/word/2012/wordml" xmlns:w16cex="http://schemas.microsoft.com/office/word/2018/wordml/cex" xmlns:w16cid="http://schemas.microsoft.com/office/word/2016/wordml/cid" xmlns:w16="http://schemas.microsoft.com/office/word/2018/wordml" xmlns:w16du="http://schemas.microsoft.com/office/word/2023/wordml/word16du" xmlns:w16sdtdh="http://schemas.microsoft.com/office/word/2020/wordml/sdtdatahash" xmlns:w16sdtfl="http://schemas.microsoft.com/office/word/2024/wordml/sdtformatlock" xmlns:w16se="http://schemas.microsoft.com/office/word/2015/wordml/symex" xmlns:wpg="http://schemas.microsoft.com/office/word/2010/wordprocessingGroup" xmlns:wpi="http://schemas.microsoft.com/office/word/2010/wordprocessingInk" xmlns:wne="http://schemas.microsoft.com/office/word/2006/wordml" xmlns:wps="http://schemas.microsoft.com/office/word/2010/wordprocessingShape" mc:Ignorable="w14 w15 w16se w16cid w16 w16cex w16sdtdh w16sdtfl w16du wp14">
   <w:sdt>
     <w:sdtPr>
       <w:id w:val="-918862502"/>
@@ -15081,7 +14938,6 @@
         <w:docPartUnique/>
       </w:docPartObj>
     </w:sdtPr>
-    <w:sdtEndPr/>
     <w:sdtContent>
       <w:p>
         <w:pPr>
@@ -15210,7 +15066,7 @@
 </file>
 
 <file path=word/numbering.xml><?xml version="1.0" encoding="utf-8"?>
-<w:numbering xmlns:wpc="http://schemas.microsoft.com/office/word/2010/wordprocessingCanvas" xmlns:cx="http://schemas.microsoft.com/office/drawing/2014/chartex" xmlns:cx1="http://schemas.microsoft.com/office/drawing/2015/9/8/chartex" xmlns:cx2="http://schemas.microsoft.com/office/drawing/2015/10/21/chartex" xmlns:cx3="http://schemas.microsoft.com/office/drawing/2016/5/9/chartex" xmlns:cx4="http://schemas.microsoft.com/office/drawing/2016/5/10/chartex" xmlns:cx5="http://schemas.microsoft.com/office/drawing/2016/5/11/chartex" xmlns:cx6="http://schemas.microsoft.com/office/drawing/2016/5/12/chartex" xmlns:cx7="http://schemas.microsoft.com/office/drawing/2016/5/13/chartex" xmlns:cx8="http://schemas.microsoft.com/office/drawing/2016/5/14/chartex" xmlns:mc="http://schemas.openxmlformats.org/markup-compatibility/2006" xmlns:aink="http://schemas.microsoft.com/office/drawing/2016/ink" xmlns:am3d="http://schemas.microsoft.com/office/drawing/2017/model3d" xmlns:o="urn:schemas-microsoft-com:office:office" xmlns:r="http://schemas.openxmlformats.org/officeDocument/2006/relationships" xmlns:m="http://schemas.openxmlformats.org/officeDocument/2006/math" xmlns:v="urn:schemas-microsoft-com:vml" xmlns:wp14="http://schemas.microsoft.com/office/word/2010/wordprocessingDrawing" xmlns:wp="http://schemas.openxmlformats.org/drawingml/2006/wordprocessingDrawing" xmlns:w10="urn:schemas-microsoft-com:office:word" xmlns:w="http://schemas.openxmlformats.org/wordprocessingml/2006/main" xmlns:w14="http://schemas.microsoft.com/office/word/2010/wordml" xmlns:w15="http://schemas.microsoft.com/office/word/2012/wordml" xmlns:w16cex="http://schemas.microsoft.com/office/word/2018/wordml/cex" xmlns:w16cid="http://schemas.microsoft.com/office/word/2016/wordml/cid" xmlns:w16="http://schemas.microsoft.com/office/word/2018/wordml" xmlns:w16sdtdh="http://schemas.microsoft.com/office/word/2020/wordml/sdtdatahash" xmlns:w16se="http://schemas.microsoft.com/office/word/2015/wordml/symex" xmlns:wpg="http://schemas.microsoft.com/office/word/2010/wordprocessingGroup" xmlns:wpi="http://schemas.microsoft.com/office/word/2010/wordprocessingInk" xmlns:wne="http://schemas.microsoft.com/office/word/2006/wordml" xmlns:wps="http://schemas.microsoft.com/office/word/2010/wordprocessingShape" mc:Ignorable="w14 w15 w16se w16cid w16 w16cex w16sdtdh wp14">
+<w:numbering xmlns:wpc="http://schemas.microsoft.com/office/word/2010/wordprocessingCanvas" xmlns:cx="http://schemas.microsoft.com/office/drawing/2014/chartex" xmlns:cx1="http://schemas.microsoft.com/office/drawing/2015/9/8/chartex" xmlns:cx2="http://schemas.microsoft.com/office/drawing/2015/10/21/chartex" xmlns:cx3="http://schemas.microsoft.com/office/drawing/2016/5/9/chartex" xmlns:cx4="http://schemas.microsoft.com/office/drawing/2016/5/10/chartex" xmlns:cx5="http://schemas.microsoft.com/office/drawing/2016/5/11/chartex" xmlns:cx6="http://schemas.microsoft.com/office/drawing/2016/5/12/chartex" xmlns:cx7="http://schemas.microsoft.com/office/drawing/2016/5/13/chartex" xmlns:cx8="http://schemas.microsoft.com/office/drawing/2016/5/14/chartex" xmlns:mc="http://schemas.openxmlformats.org/markup-compatibility/2006" xmlns:aink="http://schemas.microsoft.com/office/drawing/2016/ink" xmlns:am3d="http://schemas.microsoft.com/office/drawing/2017/model3d" xmlns:o="urn:schemas-microsoft-com:office:office" xmlns:oel="http://schemas.microsoft.com/office/2019/extlst" xmlns:r="http://schemas.openxmlformats.org/officeDocument/2006/relationships" xmlns:m="http://schemas.openxmlformats.org/officeDocument/2006/math" xmlns:v="urn:schemas-microsoft-com:vml" xmlns:wp14="http://schemas.microsoft.com/office/word/2010/wordprocessingDrawing" xmlns:wp="http://schemas.openxmlformats.org/drawingml/2006/wordprocessingDrawing" xmlns:w10="urn:schemas-microsoft-com:office:word" xmlns:w="http://schemas.openxmlformats.org/wordprocessingml/2006/main" xmlns:w14="http://schemas.microsoft.com/office/word/2010/wordml" xmlns:w15="http://schemas.microsoft.com/office/word/2012/wordml" xmlns:w16cex="http://schemas.microsoft.com/office/word/2018/wordml/cex" xmlns:w16cid="http://schemas.microsoft.com/office/word/2016/wordml/cid" xmlns:w16="http://schemas.microsoft.com/office/word/2018/wordml" xmlns:w16du="http://schemas.microsoft.com/office/word/2023/wordml/word16du" xmlns:w16sdtdh="http://schemas.microsoft.com/office/word/2020/wordml/sdtdatahash" xmlns:w16sdtfl="http://schemas.microsoft.com/office/word/2024/wordml/sdtformatlock" xmlns:w16se="http://schemas.microsoft.com/office/word/2015/wordml/symex" xmlns:wpg="http://schemas.microsoft.com/office/word/2010/wordprocessingGroup" xmlns:wpi="http://schemas.microsoft.com/office/word/2010/wordprocessingInk" xmlns:wne="http://schemas.microsoft.com/office/word/2006/wordml" xmlns:wps="http://schemas.microsoft.com/office/word/2010/wordprocessingShape" mc:Ignorable="w14 w15 w16se w16cid w16 w16cex w16sdtdh w16sdtfl w16du wp14">
   <w:abstractNum w:abstractNumId="0" w15:restartNumberingAfterBreak="0">
     <w:nsid w:val="007C554E"/>
     <w:multiLevelType w:val="multilevel"/>
@@ -20135,137 +19991,137 @@
       </w:rPr>
     </w:lvl>
   </w:abstractNum>
-  <w:num w:numId="1">
+  <w:num w:numId="1" w16cid:durableId="363605215">
     <w:abstractNumId w:val="1"/>
   </w:num>
-  <w:num w:numId="2">
+  <w:num w:numId="2" w16cid:durableId="738289670">
     <w:abstractNumId w:val="11"/>
   </w:num>
-  <w:num w:numId="3">
+  <w:num w:numId="3" w16cid:durableId="616060525">
     <w:abstractNumId w:val="23"/>
   </w:num>
-  <w:num w:numId="4">
+  <w:num w:numId="4" w16cid:durableId="1287080249">
     <w:abstractNumId w:val="18"/>
   </w:num>
-  <w:num w:numId="5">
+  <w:num w:numId="5" w16cid:durableId="1240022189">
     <w:abstractNumId w:val="30"/>
   </w:num>
-  <w:num w:numId="6">
+  <w:num w:numId="6" w16cid:durableId="1271350780">
     <w:abstractNumId w:val="33"/>
   </w:num>
-  <w:num w:numId="7">
+  <w:num w:numId="7" w16cid:durableId="1667436682">
     <w:abstractNumId w:val="4"/>
   </w:num>
-  <w:num w:numId="8">
+  <w:num w:numId="8" w16cid:durableId="1442073111">
     <w:abstractNumId w:val="34"/>
   </w:num>
-  <w:num w:numId="9">
+  <w:num w:numId="9" w16cid:durableId="1308976606">
     <w:abstractNumId w:val="36"/>
   </w:num>
-  <w:num w:numId="10">
+  <w:num w:numId="10" w16cid:durableId="578028241">
     <w:abstractNumId w:val="13"/>
   </w:num>
-  <w:num w:numId="11">
+  <w:num w:numId="11" w16cid:durableId="1128283923">
     <w:abstractNumId w:val="6"/>
   </w:num>
-  <w:num w:numId="12">
+  <w:num w:numId="12" w16cid:durableId="808476514">
     <w:abstractNumId w:val="37"/>
   </w:num>
-  <w:num w:numId="13">
+  <w:num w:numId="13" w16cid:durableId="125903476">
     <w:abstractNumId w:val="29"/>
   </w:num>
-  <w:num w:numId="14">
+  <w:num w:numId="14" w16cid:durableId="308216408">
     <w:abstractNumId w:val="38"/>
   </w:num>
-  <w:num w:numId="15">
+  <w:num w:numId="15" w16cid:durableId="2114398524">
     <w:abstractNumId w:val="25"/>
   </w:num>
-  <w:num w:numId="16">
+  <w:num w:numId="16" w16cid:durableId="1063525929">
     <w:abstractNumId w:val="39"/>
   </w:num>
-  <w:num w:numId="17">
+  <w:num w:numId="17" w16cid:durableId="1307776901">
     <w:abstractNumId w:val="15"/>
   </w:num>
-  <w:num w:numId="18">
+  <w:num w:numId="18" w16cid:durableId="22950167">
     <w:abstractNumId w:val="35"/>
   </w:num>
-  <w:num w:numId="19">
+  <w:num w:numId="19" w16cid:durableId="1933201749">
     <w:abstractNumId w:val="40"/>
   </w:num>
-  <w:num w:numId="20">
+  <w:num w:numId="20" w16cid:durableId="1586717900">
     <w:abstractNumId w:val="28"/>
   </w:num>
-  <w:num w:numId="21">
+  <w:num w:numId="21" w16cid:durableId="1973319294">
     <w:abstractNumId w:val="27"/>
   </w:num>
-  <w:num w:numId="22">
+  <w:num w:numId="22" w16cid:durableId="345912564">
     <w:abstractNumId w:val="32"/>
   </w:num>
-  <w:num w:numId="23">
+  <w:num w:numId="23" w16cid:durableId="1546868491">
     <w:abstractNumId w:val="26"/>
   </w:num>
-  <w:num w:numId="24">
+  <w:num w:numId="24" w16cid:durableId="1277911199">
     <w:abstractNumId w:val="12"/>
   </w:num>
-  <w:num w:numId="25">
+  <w:num w:numId="25" w16cid:durableId="115223775">
     <w:abstractNumId w:val="17"/>
   </w:num>
-  <w:num w:numId="26">
+  <w:num w:numId="26" w16cid:durableId="258216206">
     <w:abstractNumId w:val="24"/>
   </w:num>
-  <w:num w:numId="27">
+  <w:num w:numId="27" w16cid:durableId="789856850">
     <w:abstractNumId w:val="21"/>
   </w:num>
-  <w:num w:numId="28">
+  <w:num w:numId="28" w16cid:durableId="662858745">
     <w:abstractNumId w:val="16"/>
   </w:num>
-  <w:num w:numId="29">
+  <w:num w:numId="29" w16cid:durableId="1802305758">
     <w:abstractNumId w:val="41"/>
   </w:num>
-  <w:num w:numId="30">
+  <w:num w:numId="30" w16cid:durableId="1229992993">
     <w:abstractNumId w:val="19"/>
   </w:num>
-  <w:num w:numId="31">
+  <w:num w:numId="31" w16cid:durableId="1654866486">
     <w:abstractNumId w:val="31"/>
   </w:num>
-  <w:num w:numId="32">
+  <w:num w:numId="32" w16cid:durableId="715080236">
     <w:abstractNumId w:val="14"/>
   </w:num>
-  <w:num w:numId="33">
+  <w:num w:numId="33" w16cid:durableId="158467494">
     <w:abstractNumId w:val="5"/>
   </w:num>
-  <w:num w:numId="34">
+  <w:num w:numId="34" w16cid:durableId="702247065">
     <w:abstractNumId w:val="22"/>
   </w:num>
-  <w:num w:numId="35">
+  <w:num w:numId="35" w16cid:durableId="865749329">
     <w:abstractNumId w:val="20"/>
   </w:num>
-  <w:num w:numId="36">
+  <w:num w:numId="36" w16cid:durableId="693725049">
     <w:abstractNumId w:val="8"/>
   </w:num>
-  <w:num w:numId="37">
+  <w:num w:numId="37" w16cid:durableId="2026712403">
     <w:abstractNumId w:val="7"/>
   </w:num>
-  <w:num w:numId="38">
+  <w:num w:numId="38" w16cid:durableId="759761103">
     <w:abstractNumId w:val="2"/>
   </w:num>
-  <w:num w:numId="39">
+  <w:num w:numId="39" w16cid:durableId="751699716">
     <w:abstractNumId w:val="3"/>
   </w:num>
-  <w:num w:numId="40">
+  <w:num w:numId="40" w16cid:durableId="41175359">
     <w:abstractNumId w:val="0"/>
   </w:num>
-  <w:num w:numId="41">
+  <w:num w:numId="41" w16cid:durableId="1269701866">
     <w:abstractNumId w:val="10"/>
   </w:num>
-  <w:num w:numId="42">
+  <w:num w:numId="42" w16cid:durableId="89592106">
     <w:abstractNumId w:val="9"/>
   </w:num>
 </w:numbering>
 </file>
 
 <file path=word/styles.xml><?xml version="1.0" encoding="utf-8"?>
-<w:styles xmlns:mc="http://schemas.openxmlformats.org/markup-compatibility/2006" xmlns:r="http://schemas.openxmlformats.org/officeDocument/2006/relationships" xmlns:w="http://schemas.openxmlformats.org/wordprocessingml/2006/main" xmlns:w14="http://schemas.microsoft.com/office/word/2010/wordml" xmlns:w15="http://schemas.microsoft.com/office/word/2012/wordml" xmlns:w16cex="http://schemas.microsoft.com/office/word/2018/wordml/cex" xmlns:w16cid="http://schemas.microsoft.com/office/word/2016/wordml/cid" xmlns:w16="http://schemas.microsoft.com/office/word/2018/wordml" xmlns:w16sdtdh="http://schemas.microsoft.com/office/word/2020/wordml/sdtdatahash" xmlns:w16se="http://schemas.microsoft.com/office/word/2015/wordml/symex" mc:Ignorable="w14 w15 w16se w16cid w16 w16cex w16sdtdh">
+<w:styles xmlns:mc="http://schemas.openxmlformats.org/markup-compatibility/2006" xmlns:r="http://schemas.openxmlformats.org/officeDocument/2006/relationships" xmlns:w="http://schemas.openxmlformats.org/wordprocessingml/2006/main" xmlns:w14="http://schemas.microsoft.com/office/word/2010/wordml" xmlns:w15="http://schemas.microsoft.com/office/word/2012/wordml" xmlns:w16cex="http://schemas.microsoft.com/office/word/2018/wordml/cex" xmlns:w16cid="http://schemas.microsoft.com/office/word/2016/wordml/cid" xmlns:w16="http://schemas.microsoft.com/office/word/2018/wordml" xmlns:w16du="http://schemas.microsoft.com/office/word/2023/wordml/word16du" xmlns:w16sdtdh="http://schemas.microsoft.com/office/word/2020/wordml/sdtdatahash" xmlns:w16sdtfl="http://schemas.microsoft.com/office/word/2024/wordml/sdtformatlock" xmlns:w16se="http://schemas.microsoft.com/office/word/2015/wordml/symex" mc:Ignorable="w14 w15 w16se w16cid w16 w16cex w16sdtdh w16sdtfl w16du">
   <w:docDefaults>
     <w:rPrDefault>
       <w:rPr>

</xml_diff>